<commit_message>
docs: polish submission reports with human tone and Rotana NOB GitHub profile link
</commit_message>
<xml_diff>
--- a/docs/Rotana_Nob_AndroidAppDevelopment_Month1.docx
+++ b/docs/Rotana_Nob_AndroidAppDevelopment_Month1.docx
@@ -315,6 +315,39 @@
                 <w:sz w:val="20"/>
                 <w:szCs w:val="20"/>
               </w:rPr>
+              <w:t xml:space="preserve">GitHub Profile</w:t>
+            </w:r>
+          </w:p>
+        </w:tc>
+        <w:tc>
+          <w:tcPr>
+            <w:tcW w:type="pct" w:w="3250"/>
+          </w:tcPr>
+          <w:p>
+            <w:r>
+              <w:rPr>
+                <w:sz w:val="20"/>
+                <w:szCs w:val="20"/>
+              </w:rPr>
+              <w:t xml:space="preserve">https://github.com/Rotananob</w:t>
+            </w:r>
+          </w:p>
+        </w:tc>
+      </w:tr>
+      <w:tr>
+        <w:tc>
+          <w:tcPr>
+            <w:tcW w:type="pct" w:w="1750"/>
+            <w:shd w:fill="F3F4F6" w:val="clear"/>
+          </w:tcPr>
+          <w:p>
+            <w:r>
+              <w:rPr>
+                <w:b/>
+                <w:bCs/>
+                <w:sz w:val="20"/>
+                <w:szCs w:val="20"/>
+              </w:rPr>
               <w:t xml:space="preserve">GitHub Repository</w:t>
             </w:r>
           </w:p>
@@ -361,7 +394,7 @@
         <w:spacing w:after="240"/>
       </w:pPr>
       <w:r>
-        <w:t xml:space="preserve">During Month 1 of the Arch Technologies Remote Mobile App Development Internship, two complete, production-grade applications were designed, developed, and verified to rigorous software engineering standards:
+        <w:t xml:space="preserve">During my first month in the Arch Technologies Remote Mobile App Development Internship, I designed, developed, and verified two complete, production-grade applications meeting real-world industry standards:
 • Task 1 — College Alert Application: Engineered with Flutter 3.x, Riverpod 2.6, and a NestJS + PostgreSQL backend. It delivers real-time campus event alerts, interactive calendars, bookmarking, and native bilingual localization (English &amp; Khmer).
 • Task 2 — ShopSphere E-Commerce Application: Built with 100% Native Android Kotlin, Jetpack Compose, Room Database, and NestJS + PostgreSQL. Features an authoritative cart engine, peer-to-peer C2C product listings ("Sell Your Product"), concurrency-safe SQL stock locks, and a PCI-DSS compliant payment simulation sandbox with Luhn algorithm validation.
 Both projects follow Clean Architecture, run reliably with zero external paid third-party dependencies, and pass all automated tests.</w:t>

</xml_diff>

<commit_message>
feat(ui): add responsive mobile layout, offline fallback resilience, and embed verified UI screenshots in submission report
</commit_message>
<xml_diff>
--- a/docs/Rotana_Nob_AndroidAppDevelopment_Month1.docx
+++ b/docs/Rotana_Nob_AndroidAppDevelopment_Month1.docx
@@ -454,7 +454,8 @@
 • Bilingual Localization: Integrated native ARB files (app_en.arb and app_km.arb) supporting Khmer Unicode seamlessly.
 • Calendar &amp; Bookmarking: Interactive month/day schedule synchronizer allowing offline saved event reviews.
 • Backend Service: NestJS modular REST API with Prisma ORM and PostgreSQL 17 relational database.
-• Security: JWT access/refresh token rotation with bcrypt password hashing.</w:t>
+• Security: JWT access/refresh token rotation with bcrypt password hashing.
+• Offline &amp; Dynamic Platform Resilience: Client automatically detects running host (Android emulator vs Desktop vs Web) and provides high-fidelity fallback caching when offline.</w:t>
       </w:r>
     </w:p>
     <w:p>
@@ -470,7 +471,209 @@
           <w:sz w:val="24"/>
           <w:szCs w:val="24"/>
         </w:rPr>
-        <w:t xml:space="preserve">2.2 Implementation Code Section (Flutter)</w:t>
+        <w:t xml:space="preserve">2.2 Application Visual Design &amp; User Interface</w:t>
+      </w:r>
+    </w:p>
+    <w:p>
+      <w:pPr>
+        <w:spacing w:after="60" w:before="140"/>
+        <w:jc w:val="center"/>
+      </w:pPr>
+      <w:r>
+        <w:drawing>
+          <wp:inline distT="0" distB="0" distL="0" distR="0">
+            <wp:extent cx="4191000" cy="2952750"/>
+            <wp:effectExtent t="0" r="0" b="0" l="0"/>
+            <wp:docPr id="1" name=""/>
+            <wp:cNvGraphicFramePr>
+              <a:graphicFrameLocks xmlns:a="http://schemas.openxmlformats.org/drawingml/2006/main" noChangeAspect="1"/>
+            </wp:cNvGraphicFramePr>
+            <a:graphic xmlns:a="http://schemas.openxmlformats.org/drawingml/2006/main">
+              <a:graphicData uri="http://schemas.openxmlformats.org/drawingml/2006/picture">
+                <pic:pic xmlns:pic="http://schemas.openxmlformats.org/drawingml/2006/picture">
+                  <pic:nvPicPr>
+                    <pic:cNvPr id="0" name="" descr=""/>
+                    <pic:cNvPicPr>
+                      <a:picLocks noChangeAspect="1" noChangeArrowheads="1"/>
+                    </pic:cNvPicPr>
+                  </pic:nvPicPr>
+                  <pic:blipFill>
+                    <a:blip r:embed="rId7" cstate="none"/>
+                    <a:srcRect/>
+                    <a:stretch>
+                      <a:fillRect/>
+                    </a:stretch>
+                  </pic:blipFill>
+                  <pic:spPr bwMode="auto">
+                    <a:xfrm>
+                      <a:off x="0" y="0"/>
+                      <a:ext cx="4191000" cy="2952750"/>
+                    </a:xfrm>
+                    <a:prstGeom prst="rect">
+                      <a:avLst/>
+                    </a:prstGeom>
+                  </pic:spPr>
+                </pic:pic>
+              </a:graphicData>
+            </a:graphic>
+          </wp:inline>
+        </w:drawing>
+      </w:r>
+    </w:p>
+    <w:p>
+      <w:pPr>
+        <w:spacing w:after="180"/>
+        <w:jc w:val="center"/>
+      </w:pPr>
+      <w:r>
+        <w:rPr>
+          <w:i/>
+          <w:iCs/>
+          <w:color w:val="64748B"/>
+          <w:sz w:val="18"/>
+          <w:szCs w:val="18"/>
+        </w:rPr>
+        <w:t xml:space="preserve">Figure 1: Task 1 College Alert — Campus Home Feed with Priority Exam Notice, Featured Expo Hero &amp; Categories</w:t>
+      </w:r>
+    </w:p>
+    <w:p>
+      <w:pPr>
+        <w:spacing w:after="60" w:before="140"/>
+        <w:jc w:val="center"/>
+      </w:pPr>
+      <w:r>
+        <w:drawing>
+          <wp:inline distT="0" distB="0" distL="0" distR="0">
+            <wp:extent cx="4191000" cy="2952750"/>
+            <wp:effectExtent t="0" r="0" b="0" l="0"/>
+            <wp:docPr id="2" name=""/>
+            <wp:cNvGraphicFramePr>
+              <a:graphicFrameLocks xmlns:a="http://schemas.openxmlformats.org/drawingml/2006/main" noChangeAspect="1"/>
+            </wp:cNvGraphicFramePr>
+            <a:graphic xmlns:a="http://schemas.openxmlformats.org/drawingml/2006/main">
+              <a:graphicData uri="http://schemas.openxmlformats.org/drawingml/2006/picture">
+                <pic:pic xmlns:pic="http://schemas.openxmlformats.org/drawingml/2006/picture">
+                  <pic:nvPicPr>
+                    <pic:cNvPr id="0" name="" descr=""/>
+                    <pic:cNvPicPr>
+                      <a:picLocks noChangeAspect="1" noChangeArrowheads="1"/>
+                    </pic:cNvPicPr>
+                  </pic:nvPicPr>
+                  <pic:blipFill>
+                    <a:blip r:embed="rId8" cstate="none"/>
+                    <a:srcRect/>
+                    <a:stretch>
+                      <a:fillRect/>
+                    </a:stretch>
+                  </pic:blipFill>
+                  <pic:spPr bwMode="auto">
+                    <a:xfrm>
+                      <a:off x="0" y="0"/>
+                      <a:ext cx="4191000" cy="2952750"/>
+                    </a:xfrm>
+                    <a:prstGeom prst="rect">
+                      <a:avLst/>
+                    </a:prstGeom>
+                  </pic:spPr>
+                </pic:pic>
+              </a:graphicData>
+            </a:graphic>
+          </wp:inline>
+        </w:drawing>
+      </w:r>
+    </w:p>
+    <w:p>
+      <w:pPr>
+        <w:spacing w:after="180"/>
+        <w:jc w:val="center"/>
+      </w:pPr>
+      <w:r>
+        <w:rPr>
+          <w:i/>
+          <w:iCs/>
+          <w:color w:val="64748B"/>
+          <w:sz w:val="18"/>
+          <w:szCs w:val="18"/>
+        </w:rPr>
+        <w:t xml:space="preserve">Figure 2: Task 1 College Alert — Event Detail Screen with Live Capacity Tracker &amp; Free Booking CTA</w:t>
+      </w:r>
+    </w:p>
+    <w:p>
+      <w:pPr>
+        <w:spacing w:after="60" w:before="140"/>
+        <w:jc w:val="center"/>
+      </w:pPr>
+      <w:r>
+        <w:drawing>
+          <wp:inline distT="0" distB="0" distL="0" distR="0">
+            <wp:extent cx="4191000" cy="2952750"/>
+            <wp:effectExtent t="0" r="0" b="0" l="0"/>
+            <wp:docPr id="3" name=""/>
+            <wp:cNvGraphicFramePr>
+              <a:graphicFrameLocks xmlns:a="http://schemas.openxmlformats.org/drawingml/2006/main" noChangeAspect="1"/>
+            </wp:cNvGraphicFramePr>
+            <a:graphic xmlns:a="http://schemas.openxmlformats.org/drawingml/2006/main">
+              <a:graphicData uri="http://schemas.openxmlformats.org/drawingml/2006/picture">
+                <pic:pic xmlns:pic="http://schemas.openxmlformats.org/drawingml/2006/picture">
+                  <pic:nvPicPr>
+                    <pic:cNvPr id="0" name="" descr=""/>
+                    <pic:cNvPicPr>
+                      <a:picLocks noChangeAspect="1" noChangeArrowheads="1"/>
+                    </pic:cNvPicPr>
+                  </pic:nvPicPr>
+                  <pic:blipFill>
+                    <a:blip r:embed="rId9" cstate="none"/>
+                    <a:srcRect/>
+                    <a:stretch>
+                      <a:fillRect/>
+                    </a:stretch>
+                  </pic:blipFill>
+                  <pic:spPr bwMode="auto">
+                    <a:xfrm>
+                      <a:off x="0" y="0"/>
+                      <a:ext cx="4191000" cy="2952750"/>
+                    </a:xfrm>
+                    <a:prstGeom prst="rect">
+                      <a:avLst/>
+                    </a:prstGeom>
+                  </pic:spPr>
+                </pic:pic>
+              </a:graphicData>
+            </a:graphic>
+          </wp:inline>
+        </w:drawing>
+      </w:r>
+    </w:p>
+    <w:p>
+      <w:pPr>
+        <w:spacing w:after="180"/>
+        <w:jc w:val="center"/>
+      </w:pPr>
+      <w:r>
+        <w:rPr>
+          <w:i/>
+          <w:iCs/>
+          <w:color w:val="64748B"/>
+          <w:sz w:val="18"/>
+          <w:szCs w:val="18"/>
+        </w:rPr>
+        <w:t xml:space="preserve">Figure 3: Task 1 College Alert — Notifications Center with Urgent Exam Dispatch &amp; Unread Badges</w:t>
+      </w:r>
+    </w:p>
+    <w:p>
+      <w:pPr>
+        <w:pStyle w:val="Heading2"/>
+        <w:spacing w:after="100" w:before="160"/>
+      </w:pPr>
+      <w:r>
+        <w:rPr>
+          <w:b/>
+          <w:bCs/>
+          <w:color w:val="2563EB"/>
+          <w:sz w:val="24"/>
+          <w:szCs w:val="24"/>
+        </w:rPr>
+        <w:t xml:space="preserve">2.3 Implementation Code Section (Flutter)</w:t>
       </w:r>
     </w:p>
     <w:tbl>
@@ -997,20 +1200,69 @@
           <w:sz w:val="24"/>
           <w:szCs w:val="24"/>
         </w:rPr>
-        <w:t xml:space="preserve">3.1 Data Security &amp; Payment Safety Implementation</w:t>
-      </w:r>
-    </w:p>
-    <w:p>
-      <w:pPr>
-        <w:spacing w:after="160"/>
-      </w:pPr>
-      <w:r>
-        <w:t xml:space="preserve">In direct fulfillment of the requirement ("Addressing data security and payment safety is crucial"):
-1. Luhn Algorithm Checksum: Validates credit/debit card numbers using the standard MOD 10 arithmetic algorithm.
-2. CVV &amp; Expiry Format Security: Enforces 3 to 4 digit verification and temporal expiry checks.
-3. PCI-DSS Card Number Masking: Primary Account Numbers are tokenized and masked as "**** **** **** 1234" with unique transaction hashes (TXN-XXXXXXXX).
-4. Concurrency-Safe SQL Transactions: Server-side atomic locks (prisma.$transaction) prevent double-spending and overselling.
-5. Cryptographic Password Hashing: Bcrypt with 10 salt rounds protects user credentials.</w:t>
+        <w:t xml:space="preserve">3.1 Visual Design &amp; Native Compose UI</w:t>
+      </w:r>
+    </w:p>
+    <w:p>
+      <w:pPr>
+        <w:spacing w:after="60" w:before="140"/>
+        <w:jc w:val="center"/>
+      </w:pPr>
+      <w:r>
+        <w:drawing>
+          <wp:inline distT="0" distB="0" distL="0" distR="0">
+            <wp:extent cx="4191000" cy="2952750"/>
+            <wp:effectExtent t="0" r="0" b="0" l="0"/>
+            <wp:docPr id="4" name=""/>
+            <wp:cNvGraphicFramePr>
+              <a:graphicFrameLocks xmlns:a="http://schemas.openxmlformats.org/drawingml/2006/main" noChangeAspect="1"/>
+            </wp:cNvGraphicFramePr>
+            <a:graphic xmlns:a="http://schemas.openxmlformats.org/drawingml/2006/main">
+              <a:graphicData uri="http://schemas.openxmlformats.org/drawingml/2006/picture">
+                <pic:pic xmlns:pic="http://schemas.openxmlformats.org/drawingml/2006/picture">
+                  <pic:nvPicPr>
+                    <pic:cNvPr id="0" name="" descr=""/>
+                    <pic:cNvPicPr>
+                      <a:picLocks noChangeAspect="1" noChangeArrowheads="1"/>
+                    </pic:cNvPicPr>
+                  </pic:nvPicPr>
+                  <pic:blipFill>
+                    <a:blip r:embed="rId10" cstate="none"/>
+                    <a:srcRect/>
+                    <a:stretch>
+                      <a:fillRect/>
+                    </a:stretch>
+                  </pic:blipFill>
+                  <pic:spPr bwMode="auto">
+                    <a:xfrm>
+                      <a:off x="0" y="0"/>
+                      <a:ext cx="4191000" cy="2952750"/>
+                    </a:xfrm>
+                    <a:prstGeom prst="rect">
+                      <a:avLst/>
+                    </a:prstGeom>
+                  </pic:spPr>
+                </pic:pic>
+              </a:graphicData>
+            </a:graphic>
+          </wp:inline>
+        </w:drawing>
+      </w:r>
+    </w:p>
+    <w:p>
+      <w:pPr>
+        <w:spacing w:after="180"/>
+        <w:jc w:val="center"/>
+      </w:pPr>
+      <w:r>
+        <w:rPr>
+          <w:i/>
+          <w:iCs/>
+          <w:color w:val="64748B"/>
+          <w:sz w:val="18"/>
+          <w:szCs w:val="18"/>
+        </w:rPr>
+        <w:t xml:space="preserve">Figure 4: Task 2 ShopSphere — Native Android Kotlin Jetpack Compose Product Catalog</w:t>
       </w:r>
     </w:p>
     <w:p>
@@ -1026,7 +1278,36 @@
           <w:sz w:val="24"/>
           <w:szCs w:val="24"/>
         </w:rPr>
-        <w:t xml:space="preserve">3.2 Implementation Code Section (Kotlin)</w:t>
+        <w:t xml:space="preserve">3.2 Data Security &amp; Payment Safety Implementation</w:t>
+      </w:r>
+    </w:p>
+    <w:p>
+      <w:pPr>
+        <w:spacing w:after="160"/>
+      </w:pPr>
+      <w:r>
+        <w:t xml:space="preserve">In direct fulfillment of the requirement ("Addressing data security and payment safety is crucial"):
+1. Luhn Algorithm Checksum: Validates credit/debit card numbers using the standard MOD 10 arithmetic algorithm.
+2. CVV &amp; Expiry Format Security: Enforces 3 to 4 digit verification and temporal expiry checks.
+3. PCI-DSS Card Number Masking: Primary Account Numbers are tokenized and masked as "**** **** **** 1234" with unique transaction hashes (TXN-XXXXXXXX).
+4. Concurrency-Safe SQL Transactions: Server-side atomic locks (prisma.$transaction) prevent double-spending and overselling.
+5. Cryptographic Password Hashing: Bcrypt with 10 salt rounds protects user credentials.</w:t>
+      </w:r>
+    </w:p>
+    <w:p>
+      <w:pPr>
+        <w:pStyle w:val="Heading2"/>
+        <w:spacing w:after="100" w:before="160"/>
+      </w:pPr>
+      <w:r>
+        <w:rPr>
+          <w:b/>
+          <w:bCs/>
+          <w:color w:val="2563EB"/>
+          <w:sz w:val="24"/>
+          <w:szCs w:val="24"/>
+        </w:rPr>
+        <w:t xml:space="preserve">3.3 Implementation Code Section (Kotlin)</w:t>
       </w:r>
     </w:p>
     <w:tbl>
@@ -1460,6 +1741,68 @@
           <w:szCs w:val="28"/>
         </w:rPr>
         <w:t xml:space="preserve">4. Consolidated Automated Test Results</w:t>
+      </w:r>
+    </w:p>
+    <w:p>
+      <w:pPr>
+        <w:spacing w:after="60" w:before="140"/>
+        <w:jc w:val="center"/>
+      </w:pPr>
+      <w:r>
+        <w:drawing>
+          <wp:inline distT="0" distB="0" distL="0" distR="0">
+            <wp:extent cx="4191000" cy="2952750"/>
+            <wp:effectExtent t="0" r="0" b="0" l="0"/>
+            <wp:docPr id="5" name=""/>
+            <wp:cNvGraphicFramePr>
+              <a:graphicFrameLocks xmlns:a="http://schemas.openxmlformats.org/drawingml/2006/main" noChangeAspect="1"/>
+            </wp:cNvGraphicFramePr>
+            <a:graphic xmlns:a="http://schemas.openxmlformats.org/drawingml/2006/main">
+              <a:graphicData uri="http://schemas.openxmlformats.org/drawingml/2006/picture">
+                <pic:pic xmlns:pic="http://schemas.openxmlformats.org/drawingml/2006/picture">
+                  <pic:nvPicPr>
+                    <pic:cNvPr id="0" name="" descr=""/>
+                    <pic:cNvPicPr>
+                      <a:picLocks noChangeAspect="1" noChangeArrowheads="1"/>
+                    </pic:cNvPicPr>
+                  </pic:nvPicPr>
+                  <pic:blipFill>
+                    <a:blip r:embed="rId11" cstate="none"/>
+                    <a:srcRect/>
+                    <a:stretch>
+                      <a:fillRect/>
+                    </a:stretch>
+                  </pic:blipFill>
+                  <pic:spPr bwMode="auto">
+                    <a:xfrm>
+                      <a:off x="0" y="0"/>
+                      <a:ext cx="4191000" cy="2952750"/>
+                    </a:xfrm>
+                    <a:prstGeom prst="rect">
+                      <a:avLst/>
+                    </a:prstGeom>
+                  </pic:spPr>
+                </pic:pic>
+              </a:graphicData>
+            </a:graphic>
+          </wp:inline>
+        </w:drawing>
+      </w:r>
+    </w:p>
+    <w:p>
+      <w:pPr>
+        <w:spacing w:after="180"/>
+        <w:jc w:val="center"/>
+      </w:pPr>
+      <w:r>
+        <w:rPr>
+          <w:i/>
+          <w:iCs/>
+          <w:color w:val="64748B"/>
+          <w:sz w:val="18"/>
+          <w:szCs w:val="18"/>
+        </w:rPr>
+        <w:t xml:space="preserve">Figure 5: Verification — Multi-Platform Automated Test Suite Execution (35/35 Passed)</w:t>
       </w:r>
     </w:p>
     <w:tbl>

</xml_diff>